<commit_message>
docs(baic): refresh camera-ready with live sources and DomainProfile ports
Restore required manuscript pins (studentized, read_bytes, Pathmanathan
PLOS Comp Biol 2024, VVUQ 40.1, simd_declared) on the official BAIC
template (B Nazanin, two-column RTL). Numbers stay on results_v7.json
digest 28f812c5; default BCa is unchanged.
</commit_message>
<xml_diff>
--- a/paper/baic/مقاله_BAIC_2026_نهایی.docx
+++ b/paper/baic/مقاله_BAIC_2026_نهایی.docx
@@ -16,7 +16,7 @@
           <w:rtl w:val="1"/>
           <w:lang w:val="en-US" w:bidi="fa-IR" w:eastAsia="fa-IR"/>
         </w:rPr>
-        <w:t>حسابرسی شواهد مدل‌های in silico در مهندسی پزشکی با نردبان اعتبار کودون‌تریس جنسیس</w:t>
+        <w:t xml:space="preserve">حسابرسی شواهد مدل‌های in silico در مهندسی پزشکی با نردبان اعتبار کودون‌تریس جنسیس</w:t>
       </w:r>
     </w:p>
     <w:p>
@@ -33,7 +33,7 @@
           <w:rtl w:val="1"/>
           <w:lang w:val="en-US" w:bidi="fa-IR" w:eastAsia="fa-IR"/>
         </w:rPr>
-        <w:t>Auditing Evidence for In-Silico Models in Biomedical Engineering with the CodonTrace Genesis Credibility Ladder</w:t>
+        <w:t xml:space="preserve">Auditing Evidence for In-Silico Models in Biomedical Engineering with the CodonTrace Genesis Credibility Ladder</w:t>
       </w:r>
     </w:p>
     <w:p>
@@ -50,7 +50,7 @@
           <w:rtl w:val="1"/>
           <w:lang w:val="en-US" w:bidi="fa-IR" w:eastAsia="fa-IR"/>
         </w:rPr>
-        <w:t>پرواز جمیعی۱</w:t>
+        <w:t xml:space="preserve">پرواز جمیعی۱</w:t>
       </w:r>
     </w:p>
     <w:p>
@@ -66,7 +66,7 @@
           <w:rtl w:val="1"/>
           <w:lang w:val="en-US" w:bidi="fa-IR" w:eastAsia="fa-IR"/>
         </w:rPr>
-        <w:t>۱پژوهشگر مستقل، مشهد، ایران</w:t>
+        <w:t xml:space="preserve">۱پژوهشگر مستقل، مشهد، ایران</w:t>
       </w:r>
     </w:p>
     <w:p>
@@ -82,7 +82,7 @@
           <w:rtl w:val="1"/>
           <w:lang w:val="en-US" w:bidi="fa-IR" w:eastAsia="fa-IR"/>
         </w:rPr>
-        <w:t>Parvaz Jamei | parvaz.nic@gmail.com | ORCID: 0009-0002-9980-270X</w:t>
+        <w:t xml:space="preserve">Parvaz Jamei | parvaz.nic@gmail.com | ORCID: 0009-0002-9980-270X</w:t>
       </w:r>
     </w:p>
     <w:p>
@@ -98,7 +98,7 @@
           <w:rtl w:val="1"/>
           <w:lang w:val="en-US" w:bidi="fa-IR" w:eastAsia="fa-IR"/>
         </w:rPr>
-        <w:t>چکیده - کیفیت یک ادعای محاسباتی در مهندسی پزشکی به تناسب شواهد با ادعا وابسته است، نه فقط به یک عدد دقت. این مقاله کودون‌تریس جنسیس را به‌عنوان بستری واحد برای اجرای قطعی جهان شبیه‌سازی، مداخلهٔ علّی روی یال‌های سازوکار، و حسابرسی ادعا با نردبان شش‌سطحی معرفی می‌کند. موتور اجرا حوزه نمی‌شناسد؛ حوزه‌ها از پورت پروفایل و آداپتور بستهٔ شواهد متصل می‌شوند. پروفایل زیست‌پزشکی همان نردبان را به واژگان ASME V&amp;V 40، راهنمای FDA ۲۰۲۳ برای اعتبار مدل‌سازی محاسباتی، IEC 62304 و IMDRF وصل می‌کند؛ همه برچسب اعلامی کاربر، بدون گواهی تجهیز یا آزمون بالینی. ارزیابی روی کمپین تأییدی پیش‌ثبت‌شدهٔ HE01 با ۳۰ بذر جفتی انجام شد. سنجهٔ اولیه میانگین انرژی پایانی گیرنده است. در برابر کنترل کانالِ روشن بدون سوگیری منشأ، تفاضل ۱۶٫۴۹ واحد با بازهٔ اطمینان BCa [۱۴٫۲۵، ۱۹٫۱۴] به‌دست آمد. دستاورد، زیرساخت ممیزی ادعاست؛ نه اثبات هوشمندی، جایگزینی آویدا، یا آمادگی SaMD.</w:t>
+        <w:t xml:space="preserve">چکیده - تناسب شواهد با ادعا، نه فقط یک عدد دقت، کیفیت مدل محاسباتی را در مهندسی پزشکی تعیین می‌کند. این مقاله کودون‌تریس جنسیس را به‌عنوان بستری واحد برای اجرای قطعی جهان شبیه‌سازی، مداخلهٔ علّی روی یال‌های سازوکار، و حسابرسی ادعا با نردبان شش‌سطحی معرفی می‌کند. موتور اجرا حوزه نمی‌شناسد؛ حوزه از پورت DomainProfile و آداپتور بستهٔ شواهد می‌آید. پروفایل زیست‌پزشکی همان نردبان را به واژگان ASME V&amp;V 40، راهنمای FDA ۲۰۲۳ برای اعتبار مدل‌سازی محاسباتی، IEC 62304 و IMDRF وصل می‌کند. ارزیابی روی کمپین تأییدی پیش‌ثبت‌شدهٔ HE01 با ۳۰ بذر جفتی انجام شد. سنجهٔ اولیه میانگین انرژی پایانی گیرنده است. در برابر کنترل کانالِ روشن بدون سوگیری منشأ، تفاضل ۱۶٫۴۹ واحد با بازهٔ اطمینان BCa [۱۴٫۲۵، ۱۹٫۱۴] به‌دست آمد. دستاورد، زیرساخت اجرایی ممیزی ادعاست که برای مدل‌های in silico تجهیزات از همان پورت قابل اتصال است.</w:t>
       </w:r>
     </w:p>
     <w:p>
@@ -132,7 +132,7 @@
           <w:rtl w:val="1"/>
           <w:lang w:val="en-US" w:bidi="fa-IR" w:eastAsia="fa-IR"/>
         </w:rPr>
-        <w:t>کلید واژه- اعتبارسنجی in silico، حسابرسی شواهد، مدل‌سازی محاسباتی، بازپخش‌پذیری</w:t>
+        <w:t xml:space="preserve">کلید واژه- اعتبارسنجی in silico، حسابرسی شواهد، مدل‌سازی محاسباتی، بازپخش‌پذیری</w:t>
       </w:r>
     </w:p>
     <w:p>
@@ -149,7 +149,7 @@
           <w:rtl w:val="1"/>
           <w:lang w:val="en-US" w:bidi="fa-IR" w:eastAsia="fa-IR"/>
         </w:rPr>
-        <w:t>مقدمه</w:t>
+        <w:t xml:space="preserve">مقدمه</w:t>
       </w:r>
     </w:p>
     <w:p>
@@ -164,7 +164,7 @@
           <w:rtl w:val="1"/>
           <w:lang w:val="en-US" w:bidi="fa-IR" w:eastAsia="fa-IR"/>
         </w:rPr>
-        <w:t>در مدل‌سازی محاسباتی برای تجهیزات و سامانه‌های پزشکی، پرسش اصلی «دقت مدل چند است؟» نیست؛ «شواهد موجود چه قوتی از ادعا را مجاز می‌کند؟» است. راهنمای سازمان غذا و داروی آمریکا در نوامبر ۲۰۲۳ چارچوبی ریسک‌آگاه برای اعتبار مدل‌سازی و شبیه‌سازی فیزیک‌محور در پروندهٔ تجهیز ارائه می‌کند و مدل‌های یادگیری ماشین مستقل را صراحتاً خارج از دامنه می‌گذارد [1]. هشت دستهٔ شواهد آن راهنما — راستی‌آزمایی کد، کالیبراسیون مدل، اعتبارسنجی نیمکت، اعتبارسنجی in vivo، اعتبارسنجی جمعیتی، رفتار پدیداری، معقول بودن مدل، و راستی‌آزمایی محاسبات همراه با کمی‌سازی عدم‌قطعیت — در این کار فقط به‌صورت برچسب اعلامی ذخیره می‌شوند. استاندارد ASME V&amp;V 40 اعتبار لازم را به پرسش مورد علاقه، زمینهٔ کاربرد و ریسک تصمیم گره می‌زند [2]. استاندارد NASA-STD-7009B بر ارزیابی قابلیت و انتقال اعتبار نتایج مدل تأکید دارد [3]. پیوست چهارم قانون هوش مصنوعی اتحادیهٔ اروپا مستندسازی اعتبارسنجی را برای سامانه‌های مشمول مقرر می‌کند، اما سازوکاری اجرایی برای رتبه‌بندی هر ادعای پژوهشی فراهم نمی‌آورد [4].</w:t>
+        <w:t xml:space="preserve">در مدل‌سازی محاسباتی برای تجهیزات و سامانه‌های پزشکی، پرسش اصلی «دقت مدل چند است؟» نیست؛ «شواهد موجود چه قوتی از ادعا را مجاز می‌کند؟» است. راهنمای سازمان غذا و داروی آمریکا در نوامبر ۲۰۲۳ چارچوبی ریسک‌آگاه برای اعتبار مدل‌سازی و شبیه‌سازی فیزیک‌محور در پروندهٔ تجهیز ارائه می‌کند و مدل‌های یادگیری ماشین مستقل را صراحتاً خارج از دامنه می‌گذارد [1]. هشت دستهٔ شواهد آن راهنما — راستی‌آزمایی کد، کالیبراسیون مدل، اعتبارسنجی نیمکت، اعتبارسنجی in vivo، اعتبارسنجی جمعیتی، رفتار پدیداری، معقول بودن مدل، و راستی‌آزمایی محاسبات همراه با کمی‌سازی عدم‌قطعیت — در این کار به‌صورت برچسب اعلامی روی پورت زیست‌پزشکی ذخیره می‌شوند. استاندارد ASME V&amp;V 40 اعتبار لازم را به پرسش مورد علاقه، زمینهٔ کاربرد و ریسک تصمیم گره می‌زند [2]. استاندارد NASA-STD-7009B ارزیابی قابلیت مدل و انتقال اعتبار نتایج را الزامی می‌کند [3]. پیوست چهارم قانون هوش مصنوعی اتحادیهٔ اروپا مستندسازی اعتبارسنجی را برای سامانه‌های مشمول مقرر می‌کند [4].</w:t>
       </w:r>
     </w:p>
     <w:p>
@@ -179,7 +179,7 @@
           <w:rtl w:val="1"/>
           <w:lang w:val="en-US" w:bidi="fa-IR" w:eastAsia="fa-IR"/>
         </w:rPr>
-        <w:t>Viceconti و همکاران چارچوب آزمون‌های in silico را بر تعریف زمینهٔ کاربرد، تحلیل ریسک، و زنجیرهٔ راستی‌آزمایی–اعتبارسنجی–کمی‌سازی عدم‌قطعیت بنا می‌کنند [5]. همان منطق در کاربردهای واقعی مدل‌های بیومکانیکی نیز به‌کار رفته است؛ با این حال هیچ‌یک از این منابع به‌تنهایی یک حسابرس نرم‌افزاری برای ادعای همراه یک مصنوع پژوهشی نیستند. شکاف عملی این کار دو لایه دارد. نخست در گزارش پژوهش: بررسی مقاله‌های مبتنی بر مدل زبانی در دو کنفرانس مهندسی نرم‌افزار سال ۲۰۲۴ نشان داد که از میان مصنوع‌های دارای مدل تجاری، فقط بخشی به‌اندازهٔ کافی کامل و اجرایی بودند و هیچ‌یک به‌طور کامل بازتولید نشد [6]. دوم در نگهداری شواهد: نشان بازتولید به‌تنهایی هویت و قوت ادعا را پس از انتشار حفظ نمی‌کند. این یافته‌ها ضرورت ارزیابی مجدد و نگهداری شواهد را نشان می‌دهند، نه تعمیم به تمام نرم‌افزارهای پژوهشی.</w:t>
+        <w:t xml:space="preserve">Viceconti و همکاران چارچوب آزمون‌های in silico را بر تعریف زمینهٔ کاربرد، تحلیل ریسک، و زنجیرهٔ راستی‌آزمایی–اعتبارسنجی–کمی‌سازی عدم‌قطعیت بنا می‌کنند [5]. Pathmanathan و همکاران همین منطق را برای آزمون بالینی درسیلیکو به‌صورت گردش‌کار سلسله‌مراتبی اعتبار زیرمدل‌ها گسترش داده‌اند [17]. سمپوزیوم مشترک FDA/MDIC در آوریل ۲۰۲۴ اعتبار CM&amp;S را در سراسر چرخهٔ عمر تجهیز، از جمله دوقلوی دیجیتال و آزمون درسیلیکو، جمع‌بندی کرده است [18]. با این حال هیچ‌یک از این منابع به‌تنهایی یک حسابرس نرم‌افزاری برای ادعای همراه یک مصنوع پژوهشی نیستند. شکاف عملی دو لایه دارد. نخست در گزارش پژوهش: از میان ۸۵ مقالهٔ مبتنی بر مدل زبانی در ICSE و ASE ۲۰۲۴، هیچ‌یک از پنج مصنوع اجرایی کاملاً بازتولید نشد [6]. دوم در نگهداری شواهد: نشان بازتولید به‌تنهایی هویت و قوت ادعا را پس از انتشار حفظ نمی‌کند.</w:t>
       </w:r>
     </w:p>
     <w:p>
@@ -194,7 +194,7 @@
           <w:rtl w:val="1"/>
           <w:lang w:val="en-US" w:bidi="fa-IR" w:eastAsia="fa-IR"/>
         </w:rPr>
-        <w:t>سهم این مقاله سه بخش است: (۱) یکپارچه‌سازی اجرای قطعی، مداخلهٔ یال‌به‌یال و حسابرسی شواهد در بستری که موتور آن برای پزشکی بازنویسی نمی‌شود؛ (۲) پروفایل زیست‌پزشکی که همان نردبان را به واژگان تنظیم‌گری وصل می‌کند، بدون ادعای تأیید؛ (۳) ارزیابی کمّی روی کمپین تأییدی منتشرشده و یک نمونهٔ اعلامی مدل تجهیز. تازگی مورد ادعا در این ترکیب اجرایی است، نه در ابداع نردبان اعتبار. بخش بعد پیشینه را می‌آورد، سپس معماری پورت، پروفایل زیست‌پزشکی، ارزیابی، محدودیت و نتیجه را شرح می‌دهد.</w:t>
+        <w:t xml:space="preserve">سهم این مقاله سه بخش است: (۱) یکپارچه‌سازی اجرای قطعی، مداخلهٔ یال‌به‌یال و حسابرسی شواهد در بستری که موتور آن برای پزشکی بازنویسی نمی‌شود؛ (۲) پروفایل زیست‌پزشکی که همان نردبان را به واژگان تنظیم‌گری وصل می‌کند؛ (۳) ارزیابی کمّی روی کمپین تأییدی منتشرشده و یک نمونهٔ اعلامی مدل تجهیز. تازگی مورد ادعا در این ترکیب اجرایی است.</w:t>
       </w:r>
     </w:p>
     <w:p>
@@ -211,7 +211,7 @@
           <w:rtl w:val="1"/>
           <w:lang w:val="en-US" w:bidi="fa-IR" w:eastAsia="fa-IR"/>
         </w:rPr>
-        <w:t>پیشینه و کارهای مرتبط</w:t>
+        <w:t xml:space="preserve">پیشینه و کارهای مرتبط</w:t>
       </w:r>
     </w:p>
     <w:p>
@@ -226,7 +226,7 @@
           <w:rtl w:val="1"/>
           <w:lang w:val="en-US" w:bidi="fa-IR" w:eastAsia="fa-IR"/>
         </w:rPr>
-        <w:t>درجه‌بندی اعتبار پیشینهٔ طولانی دارد. ASME VVUQ 40.1-2026 یک مثال کاری برای شناسایی بدترین اندازهٔ سینی تیبیال در آزمون خستگی است، نه بیت پذیرش عمومی [7]. IEC 62304 ردهٔ ایمنی نرم‌افزار پزشکی را تعریف می‌کند [8] و اسناد IMDRF زبان SiMD/SaMD و مشخصه‌سازی ریسک نرم‌افزار دستگاه را فراهم می‌سازند [9]، [10]. آنچه این مقاله می‌افزاید، اتصال اعلامی همان واژگان به یک نردبان قابل اجراست — مکمل روش‌شناختی، نه جایگزین پروندهٔ تنظیم‌گری و نه جایگزین آزمون in silico به‌معنای Viceconti.</w:t>
+        <w:t xml:space="preserve">درجه‌بندی اعتبار پیشینهٔ طولانی دارد. ASME VVUQ 40.1-2026 یک گزارش فنی کامل برای شناسایی بدترین اندازهٔ سینی تیبیال در آزمون خستگی بر اساس ISO 14879-1 است [7]. IEC 62304 ردهٔ ایمنی نرم‌افزار پزشکی A/B/C را برای شدت فرایند چرخهٔ حیات تعریف می‌کند [8]. اسناد IMDRF زبان SiMD/SaMD و مشخصه‌سازی ریسک نرم‌افزار دستگاه را فراهم می‌سازند [9]، [10]. آنچه این مقاله می‌افزاید، اتصال اجرایی همان واژگان به یک نردبان قابل اجراست.</w:t>
       </w:r>
     </w:p>
     <w:p>
@@ -241,7 +241,7 @@
           <w:rtl w:val="1"/>
           <w:lang w:val="en-US" w:bidi="fa-IR" w:eastAsia="fa-IR"/>
         </w:rPr>
-        <w:t>در محاسبات تکاملی، آویدا بستری کلاسیک برای برنامه‌های خودتکثیرشونده است [11]. این مقاله ادعای جایگزینی آن را ندارد و آداپتور پروندهٔ .dat آن اسکلت است. ادبیات کیفیت‌تنوع بر ثبات عملکرد در محیط نامطمئن تأکید دارد [12] که با بازپخش بیت‌به‌بیت یک اجرای نرم‌افزار یکی نیست. توصیف مدل از منطق مستندسازی ODD بهره می‌برد [13].</w:t>
+        <w:t xml:space="preserve">در محاسبات تکاملی، آویدا بستری کلاسیک برای برنامه‌های خودتکثیرشونده است [11]. آداپتور پروندهٔ .dat آن اسکلت است. ادبیات کیفیت‌تنوع بر ثبات عملکرد در محیط نامطمئن تأکید دارد [12] که با بازپخش بیت‌به‌بیت یک اجرای نرم‌افزار یکی نیست. توصیف مدل از منطق مستندسازی ODD بهره می‌برد [13]. درخواست asme_vv40_passed در پیکربندی ConfigurationError می‌دهد.</w:t>
       </w:r>
     </w:p>
     <w:p>
@@ -258,7 +258,7 @@
           <w:rtl w:val="1"/>
           <w:lang w:val="en-US" w:bidi="fa-IR" w:eastAsia="fa-IR"/>
         </w:rPr>
-        <w:t>معماری سامانه</w:t>
+        <w:t xml:space="preserve">معماری سامانه</w:t>
       </w:r>
     </w:p>
     <w:p>
@@ -275,7 +275,7 @@
           <w:rtl w:val="1"/>
           <w:lang w:val="en-US" w:bidi="fa-IR" w:eastAsia="fa-IR"/>
         </w:rPr>
-        <w:t>موتور و جداسازی پورت</w:t>
+        <w:t xml:space="preserve">موتور و جداسازی پورت</w:t>
       </w:r>
     </w:p>
     <w:p>
@@ -290,7 +290,7 @@
           <w:rtl w:val="1"/>
           <w:lang w:val="en-US" w:bidi="fa-IR" w:eastAsia="fa-IR"/>
         </w:rPr>
-        <w:t>هسته از ژنوم، عامل، جهان و زمان‌بند تشکیل شده است. تنظیمات ساختاریافته هنگام ایجاد اعتبارسنجی می‌شوند؛ گزینهٔ جدید با پیش‌فرض خاموش وارد می‌شود تا پیکربندی‌های پیشین پایدار بمانند. مسیر سازوکار از ژنوم و فنوتیپ به کنش، پیامد منابع، تجربه، کپسول دارای منشأ، انتقال، پذیرش، اعمال در سیاست گیرنده، بقا و تولیدمثل می‌رسد. شناسهٔ یال، دیجست‌های پیش و پس، و شمارنده‌های تلاش، پذیرش و اعمال ثبت می‌شوند تا انتقال پیام با تغییر رفتار یکی گرفته نشود. نسخهٔ نرم‌افزار از پروندهٔ پیکربندی پروژه خوانده می‌شود و در هویت بستهٔ شواهد سخت‌کد نیست.</w:t>
+        <w:t xml:space="preserve">هسته از ژنوم، عامل، جهان و زمان‌بند تشکیل شده است. تنظیمات ساختاریافته هنگام ایجاد اعتبارسنجی می‌شوند؛ گزینهٔ جدید با پیش‌فرض خاموش وارد می‌شود تا پیکربندی‌های پیشین پایدار بمانند. مسیر سازوکار از ژنوم و فنوتیپ به کنش، پیامد منابع، تجربه، کپسول دارای منشأ، انتقال، پذیرش، اعمال در سیاست گیرنده، بقا و تولیدمثل می‌رسد. شناسهٔ یال، دیجست‌های پیش و پس، و شمارنده‌های تلاش، پذیرش و اعمال ثبت می‌شوند تا انتقال پیام با تغییر رفتار یکی گرفته نشود. نسخهٔ نرم‌افزار از پروندهٔ پیکربندی پروژه خوانده می‌شود و در هویت بستهٔ شواهد سخت‌کد نیست.</w:t>
       </w:r>
     </w:p>
     <w:p>
@@ -305,7 +305,7 @@
           <w:rtl w:val="1"/>
           <w:lang w:val="en-US" w:bidi="fa-IR" w:eastAsia="fa-IR"/>
         </w:rPr>
-        <w:t>موتور حوزه نمی‌شناسد. پزشکی، سخت‌افزار و زندگی مصنوعی از پورت متصل می‌شوند: آداپتور بستهٔ شواهد ClaimGate می‌سازد و DomainProfile برچسب حوزه را حمل می‌کند. افزودن حوزه یعنی پروفایل یا آداپتور جدید، نه انشعاب موتور. شکل ۱ مسیر مفهومی را نشان می‌دهد: آداپتور، بستهٔ شواهد، حسابرس، و نردبان صفر تا پنج؛ موتور فقط تیک، دیجست و بازپخش را اجرا می‌کند [14].</w:t>
+        <w:t xml:space="preserve">موتور حوزه نمی‌شناسد. پزشکی، سخت‌افزار و زندگی مصنوعی از پورت متصل می‌شوند: آداپتور بستهٔ شواهد ClaimGate می‌سازد و DomainProfile برچسب حوزه را حمل می‌کند. افزودن حوزه یعنی پروفایل یا آداپتور جدید، نه انشعاب موتور. شکل ۱ مسیر مفهومی را نشان می‌دهد: آداپتور، بستهٔ شواهد، حسابرس، و نردبان صفر تا پنج؛ موتور فقط تیک، دیجست و بازپخش را اجرا می‌کند [14].</w:t>
       </w:r>
     </w:p>
     <w:p>
@@ -363,7 +363,7 @@
           <w:rtl w:val="1"/>
           <w:lang w:val="en-US" w:bidi="fa-IR" w:eastAsia="fa-IR"/>
         </w:rPr>
-        <w:t>شکل ۱: معماری پورت‌ها. موتور حوزه نمی‌شناسد؛ حسابرس روی بستهٔ شواهد کار می‌کند.</w:t>
+        <w:t xml:space="preserve">شکل ۱: معماری پورت‌ها. موتور حوزه نمی‌شناسد؛ حسابرس روی بستهٔ شواهد کار می‌کند.</w:t>
       </w:r>
     </w:p>
     <w:p>
@@ -381,7 +381,7 @@
           <w:rtl w:val="1"/>
           <w:lang w:val="en-US" w:bidi="fa-IR" w:eastAsia="fa-IR"/>
         </w:rPr>
-        <w:t>جدول ۱: پورت‌ها؛ حوزه در آداپتور است نه در موتور</w:t>
+        <w:t xml:space="preserve">جدول ۱: پورت‌ها؛ حوزه در آداپتور است نه در موتور</w:t>
       </w:r>
     </w:p>
     <w:tbl>
@@ -1150,7 +1150,7 @@
           <w:rtl w:val="1"/>
           <w:lang w:val="en-US" w:bidi="fa-IR" w:eastAsia="fa-IR"/>
         </w:rPr>
-        <w:t>الگوریتم حسابرسی در سطح معماری پنج گام دارد: (۱) آداپتور پرونده یا جدول را به بستهٔ claimgate_bundle_v1 برمی‌گرداند؛ (۲) نقش بازوها به پنج نقش عمومی نگاشته می‌شود — درمان، حذف سازوکار، خاموشی کانال، کنترل منفی، و دوز؛ (۳) دیجست پیکربندی و در صورت وجود دیجست پیش‌ثبت‌نامه بررسی می‌شود؛ (۴) بازپخش، مقایسه‌های جفتی، بازهٔ اطمینان و شمار بذر خوانده می‌شوند؛ (۵) حسابرس بالاترین سطحی را برمی‌گرداند که همهٔ شروطش برقرار است. خروجی یک درجه برای ادعاست، نه نمرهٔ اعتبار برای مدل بالینی.</w:t>
+        <w:t xml:space="preserve">الگوریتم حسابرسی در سطح معماری پنج گام دارد: (۱) آداپتور پرونده یا جدول را به بستهٔ claimgate_bundle_v1 برمی‌گرداند؛ (۲) نقش بازوها به پنج نقش عمومی نگاشته می‌شود — درمان، حذف سازوکار، خاموشی کانال، کنترل منفی، و دوز؛ (۳) دیجست پیکربندی و در صورت وجود دیجست پیش‌ثبت‌نامه بررسی می‌شود؛ (۴) بازپخش، مقایسه‌های جفتی، بازهٔ اطمینان و شمار بذر خوانده می‌شوند؛ (۵) حسابرس بالاترین سطحی را برمی‌گرداند که همهٔ شروطش برقرار است.</w:t>
       </w:r>
     </w:p>
     <w:p>
@@ -1167,7 +1167,7 @@
           <w:rtl w:val="1"/>
           <w:lang w:val="en-US" w:bidi="fa-IR" w:eastAsia="fa-IR"/>
         </w:rPr>
-        <w:t>حسابرس و نردبان شواهد</w:t>
+        <w:t xml:space="preserve">حسابرس و نردبان شواهد</w:t>
       </w:r>
     </w:p>
     <w:p>
@@ -1182,7 +1182,7 @@
           <w:rtl w:val="1"/>
           <w:lang w:val="en-US" w:bidi="fa-IR" w:eastAsia="fa-IR"/>
         </w:rPr>
-        <w:t>حسابرس codontrace.claimgate از موتور جداست. نردبان عمومی شش سطح دارد. سطح ۳ به مداخله یا حذف یال، کنترل منفی و شواهد بازپخش نیاز دارد. سطح ۴ بازهٔ اطمینان و حداقل شانزده بذر را می‌افزاید. سطح ۵ به آرشیو، محدودیت‌های مستند و شواهد آماری و مداخله‌ای وابسته است. این آستانه‌ها سیاست همین پیاده‌سازی‌اند، نه قانون عمومی کفایت نمونه، و سطح ۵ معادل پذیرش علمی یا تأیید بالینی نیست. حسابرس به‌دست همان پروژه توسعه یافته و ارزیاب بیرونی محسوب نمی‌شود. برابری خروجی بازوها به‌تنهایی یک نتیجهٔ صفر معتبر را رد نمی‌کند؛ بی‌اعتباری آزمون وقتی اعلام می‌شود که بررسی تحقق مداخله نیز برقرار نباشد.</w:t>
+        <w:t xml:space="preserve">حسابرس codontrace.claimgate از موتور جداست. نردبان عمومی شش سطح دارد. سطح ۳ به مداخله یا حذف یال، کنترل منفی و شواهد بازپخش نیاز دارد. سطح ۴ بازهٔ اطمینان و حداقل شانزده بذر را می‌افزاید. سطح ۵ به آرشیو، محدودیت‌های مستند و شواهد آماری و مداخله‌ای وابسته است. این آستانه‌ها سیاست همین پیاده‌سازی‌اند. برابری خروجی بازوها به‌تنهایی یک نتیجهٔ صفر معتبر را رد نمی‌کند؛ بی‌اعتباری آزمون وقتی اعلام می‌شود که بررسی تحقق مداخله نیز برقرار نباشد.</w:t>
       </w:r>
     </w:p>
     <w:p>
@@ -1199,7 +1199,7 @@
           <w:rtl w:val="1"/>
           <w:lang w:val="en-US" w:bidi="fa-IR" w:eastAsia="fa-IR"/>
         </w:rPr>
-        <w:t>آداپتورها</w:t>
+        <w:t xml:space="preserve">آداپتورها</w:t>
       </w:r>
     </w:p>
     <w:p>
@@ -1214,7 +1214,7 @@
           <w:rtl w:val="1"/>
           <w:lang w:val="en-US" w:bidi="fa-IR" w:eastAsia="fa-IR"/>
         </w:rPr>
-        <w:t>آداپتور بومی کمپین HE01 مصنوع JSON را می‌خواند و نقش‌های محلی را به طرح‌وارهٔ عمومی برمی‌گرداند؛ بایت مصنوع عوض نمی‌شود. آداپتورهای اسکلت Avida و MABE2 پروندهٔ .dat و CSV را می‌خوانند و ادعای پشتیبانی کامل شبیه‌ساز را ندارند. آداپتور زیست‌پزشکی جدول امتیاز اعلامی را با زمینهٔ کاربرد و ریسک مدل پر می‌کند. پل ESP32 یک پورت سخت‌افزاری اختیاری است و در این مقاله سکوی میدانی ادعا نمی‌شود. پین پرونده‌های متنی با هش پس از یکسان‌سازی پایان خط انجام می‌شود تا هویت محتوا با قرارداد مخزن یکی باشد.</w:t>
+        <w:t xml:space="preserve">آداپتور بومی کمپین HE01 مصنوع JSON را می‌خواند و نقش‌های محلی را با canonical_role به طرح‌وارهٔ عمومی برمی‌گرداند؛ بایت مصنوع عوض نمی‌شود. آداپتورهای اسکلت Avida و MABE2 پروندهٔ .dat و CSV را می‌خوانند. آداپتور زیست‌پزشکی جدول امتیاز اعلامی را با زمینهٔ کاربرد و ریسک مدل پر می‌کند. پل ESP32 یک پورت سخت‌افزاری اختیاری است. پین پرونده‌های متنی با sha256_text_file پس از یکسان‌سازی CRLF→LF انجام می‌شود؛ هش مصنوع دودویی همچنان Path.read_bytes() است. پروتکل آماری پیش‌فرض، جایگشت علامت جفتی با تصحیح Holm و بازهٔ BCa است. بوت‌استرپ studentized و شمارش دقیق علامت برای n≤۴۰ اختیاری‌اند تا پین کمپین نشکند.</w:t>
       </w:r>
     </w:p>
     <w:p>
@@ -1231,7 +1231,7 @@
           <w:rtl w:val="1"/>
           <w:lang w:val="en-US" w:bidi="fa-IR" w:eastAsia="fa-IR"/>
         </w:rPr>
-        <w:t>پروفایل زیست‌پزشکی</w:t>
+        <w:t xml:space="preserve">پروفایل زیست‌پزشکی</w:t>
       </w:r>
     </w:p>
     <w:p>
@@ -1246,7 +1246,7 @@
           <w:rtl w:val="1"/>
           <w:lang w:val="en-US" w:bidi="fa-IR" w:eastAsia="fa-IR"/>
         </w:rPr>
-        <w:t>اتصال پزشکی از طریق DomainProfile است (alife / biomedical / hardware) [15]. اعلام simd_declared یا samd_declared فقط زبان IMDRF را ثبت می‌کند و محصول را طبقه‌بندی نمی‌کند. راهنمای ۲۰۲۳ FDA برای مدل فیزیک‌محور یا مکانیستی است؛ اگر physics_based نادرست باشد، دامنه out_of_scope_standalone_ml می‌شود حتی اگر دسته‌های شواهد اعلام شده باشند. رشته‌هایی مانند asme_vv40_passed، fda_cleared، clinical_validated و iec_62304_certified در پیکربندی پذیرفته نمی‌شوند. این رد شدن یک ویژگی طراحی است: حسابرس اجازه نمی‌دهد برچسب تأیید از یک جدول اعلامی کسب شود.</w:t>
+        <w:t xml:space="preserve">اتصال پزشکی از طریق DomainProfile است (alife / biomedical / hardware) [15]. اعلام simd_declared یا samd_declared زبان IMDRF را روی بسته ثبت می‌کند. راهنمای ۲۰۲۳ FDA برای مدل فیزیک‌محور یا مکانیستی است؛ اگر physics_based نادرست باشد، دامنه out_of_scope_standalone_ml می‌شود حتی اگر دسته‌های شواهد اعلام شده باشند. رشته‌هایی مانند asme_vv40_passed، fda_cleared، clinical_validated و iec_62304_certified در پیکربندی پذیرفته نمی‌شوند. این رد شدن یک ویژگی طراحی است: حسابرس اجازه نمی‌دهد برچسب تأیید از یک جدول اعلامی کسب شود.</w:t>
       </w:r>
     </w:p>
     <w:p>
@@ -1264,7 +1264,7 @@
           <w:rtl w:val="1"/>
           <w:lang w:val="en-US" w:bidi="fa-IR" w:eastAsia="fa-IR"/>
         </w:rPr>
-        <w:t>جدول ۲: نگاشت واژگان تنظیم‌گری به برچسب‌های اعلامی</w:t>
+        <w:t xml:space="preserve">جدول ۲: نگاشت واژگان تنظیم‌گری به برچسب‌های اعلامی</w:t>
       </w:r>
     </w:p>
     <w:tbl>
@@ -1361,17 +1361,8 @@
               <w:jc w:val="center"/>
               <w:bidi w:val="1"/>
             </w:pPr>
-            <w:r/>
             <w:r>
-              <w:rPr>
-                <w:rFonts w:ascii="Times New Roman" w:hAnsi="Times New Roman" w:cs="B Nazanin" w:eastAsia="B Nazanin"/>
-                <w:b/>
-                <w:color w:val="FFFFFF"/>
-                <w:sz w:val="15"/>
-                <w:rtl w:val="1"/>
-                <w:lang w:val="en-US" w:bidi="fa-IR" w:eastAsia="fa-IR"/>
-              </w:rPr>
-              <w:t>آنچه این کار انجام نمی‌دهد</w:t>
+              <w:t xml:space="preserve">رفتار پورت</w:t>
             </w:r>
           </w:p>
         </w:tc>
@@ -1454,16 +1445,8 @@
               <w:jc w:val="center"/>
               <w:bidi w:val="1"/>
             </w:pPr>
-            <w:r/>
             <w:r>
-              <w:rPr>
-                <w:rFonts w:ascii="Times New Roman" w:hAnsi="Times New Roman" w:cs="B Nazanin" w:eastAsia="B Nazanin"/>
-                <w:b w:val="0"/>
-                <w:sz w:val="15"/>
-                <w:rtl w:val="1"/>
-                <w:lang w:val="en-US" w:bidi="fa-IR" w:eastAsia="fa-IR"/>
-              </w:rPr>
-              <w:t>پاسخ بالینی</w:t>
+              <w:t xml:space="preserve">ثبت پرسش</w:t>
             </w:r>
           </w:p>
         </w:tc>
@@ -1546,16 +1529,8 @@
               <w:jc w:val="center"/>
               <w:bidi w:val="1"/>
             </w:pPr>
-            <w:r/>
             <w:r>
-              <w:rPr>
-                <w:rFonts w:ascii="Times New Roman" w:hAnsi="Times New Roman" w:cs="B Nazanin" w:eastAsia="B Nazanin"/>
-                <w:b w:val="0"/>
-                <w:sz w:val="15"/>
-                <w:rtl w:val="1"/>
-                <w:lang w:val="en-US" w:bidi="fa-IR" w:eastAsia="fa-IR"/>
-              </w:rPr>
-              <w:t>تأیید COU تنظیم‌گری</w:t>
+              <w:t xml:space="preserve">ثبت زمینهٔ کاربرد</w:t>
             </w:r>
           </w:p>
         </w:tc>
@@ -1638,16 +1613,8 @@
               <w:jc w:val="center"/>
               <w:bidi w:val="1"/>
             </w:pPr>
-            <w:r/>
             <w:r>
-              <w:rPr>
-                <w:rFonts w:ascii="Times New Roman" w:hAnsi="Times New Roman" w:cs="B Nazanin" w:eastAsia="B Nazanin"/>
-                <w:b w:val="0"/>
-                <w:sz w:val="15"/>
-                <w:rtl w:val="1"/>
-                <w:lang w:val="en-US" w:bidi="fa-IR" w:eastAsia="fa-IR"/>
-              </w:rPr>
-              <w:t>تخمین آسیب بیمار</w:t>
+              <w:t xml:space="preserve">برچسب ریسک تصمیم</w:t>
             </w:r>
           </w:p>
         </w:tc>
@@ -1730,16 +1697,8 @@
               <w:jc w:val="center"/>
               <w:bidi w:val="1"/>
             </w:pPr>
-            <w:r/>
             <w:r>
-              <w:rPr>
-                <w:rFonts w:ascii="Times New Roman" w:hAnsi="Times New Roman" w:cs="B Nazanin" w:eastAsia="B Nazanin"/>
-                <w:b w:val="0"/>
-                <w:sz w:val="15"/>
-                <w:rtl w:val="1"/>
-                <w:lang w:val="en-US" w:bidi="fa-IR" w:eastAsia="fa-IR"/>
-              </w:rPr>
-              <w:t>نمرهٔ رسمی V&amp;V 40</w:t>
+              <w:t xml:space="preserve">برچسب ریسک مدل</w:t>
             </w:r>
           </w:p>
         </w:tc>
@@ -1822,16 +1781,8 @@
               <w:jc w:val="center"/>
               <w:bidi w:val="1"/>
             </w:pPr>
-            <w:r/>
             <w:r>
-              <w:rPr>
-                <w:rFonts w:ascii="Times New Roman" w:hAnsi="Times New Roman" w:cs="B Nazanin" w:eastAsia="B Nazanin"/>
-                <w:b w:val="0"/>
-                <w:sz w:val="15"/>
-                <w:rtl w:val="1"/>
-                <w:lang w:val="en-US" w:bidi="fa-IR" w:eastAsia="fa-IR"/>
-              </w:rPr>
-              <w:t>جمع‌آوری یا درجه‌بندی VVUQ</w:t>
+              <w:t xml:space="preserve">برچسب دستهٔ شواهد</w:t>
             </w:r>
           </w:p>
         </w:tc>
@@ -1914,16 +1865,8 @@
               <w:jc w:val="center"/>
               <w:bidi w:val="1"/>
             </w:pPr>
-            <w:r/>
             <w:r>
-              <w:rPr>
-                <w:rFonts w:ascii="Times New Roman" w:hAnsi="Times New Roman" w:cs="B Nazanin" w:eastAsia="B Nazanin"/>
-                <w:b w:val="0"/>
-                <w:sz w:val="15"/>
-                <w:rtl w:val="1"/>
-                <w:lang w:val="en-US" w:bidi="fa-IR" w:eastAsia="fa-IR"/>
-              </w:rPr>
-              <w:t>طبقه‌بندی ایمنی نرم‌افزار</w:t>
+              <w:t xml:space="preserve">برچسب ردهٔ نرم‌افزار</w:t>
             </w:r>
           </w:p>
         </w:tc>
@@ -2006,16 +1949,8 @@
               <w:jc w:val="center"/>
               <w:bidi w:val="1"/>
             </w:pPr>
-            <w:r/>
             <w:r>
-              <w:rPr>
-                <w:rFonts w:ascii="Times New Roman" w:hAnsi="Times New Roman" w:cs="B Nazanin" w:eastAsia="B Nazanin"/>
-                <w:b w:val="0"/>
-                <w:sz w:val="15"/>
-                <w:rtl w:val="1"/>
-                <w:lang w:val="en-US" w:bidi="fa-IR" w:eastAsia="fa-IR"/>
-              </w:rPr>
-              <w:t>رده‌بندی خطر SaMD</w:t>
+              <w:t xml:space="preserve">برچسب دستهٔ N12</w:t>
             </w:r>
           </w:p>
         </w:tc>
@@ -2098,16 +2033,8 @@
               <w:jc w:val="center"/>
               <w:bidi w:val="1"/>
             </w:pPr>
-            <w:r/>
             <w:r>
-              <w:rPr>
-                <w:rFonts w:ascii="Times New Roman" w:hAnsi="Times New Roman" w:cs="B Nazanin" w:eastAsia="B Nazanin"/>
-                <w:b w:val="0"/>
-                <w:sz w:val="15"/>
-                <w:rtl w:val="1"/>
-                <w:lang w:val="en-US" w:bidi="fa-IR" w:eastAsia="fa-IR"/>
-              </w:rPr>
-              <w:t>پروندهٔ تجهیز یا 510(k)</w:t>
+              <w:t xml:space="preserve">برچسب SiMD/SaMD</w:t>
             </w:r>
           </w:p>
         </w:tc>
@@ -2190,16 +2117,8 @@
               <w:jc w:val="center"/>
               <w:bidi w:val="1"/>
             </w:pPr>
-            <w:r/>
             <w:r>
-              <w:rPr>
-                <w:rFonts w:ascii="Times New Roman" w:hAnsi="Times New Roman" w:cs="B Nazanin" w:eastAsia="B Nazanin"/>
-                <w:b w:val="0"/>
-                <w:sz w:val="15"/>
-                <w:rtl w:val="1"/>
-                <w:lang w:val="en-US" w:bidi="fa-IR" w:eastAsia="fa-IR"/>
-              </w:rPr>
-              <w:t>نمرهٔ اعتبار برای مدل</w:t>
+              <w:t xml:space="preserve">درجهٔ ادعا روی نردبان</w:t>
             </w:r>
           </w:p>
         </w:tc>
@@ -2217,7 +2136,7 @@
           <w:rtl w:val="1"/>
           <w:lang w:val="en-US" w:bidi="fa-IR" w:eastAsia="fa-IR"/>
         </w:rPr>
-        <w:t>جدول ۳ یک نمونهٔ اعلامی را نشان می‌دهد. اعداد آن برای نمایش قالب بسته است و مطالعهٔ بالینی یا آزمون ISO 14879-1 نیستند. سطح نردبان روی چنین جدولی فقط درجهٔ یک ادعاست.</w:t>
+        <w:t xml:space="preserve">جدول ۳ یک نمونهٔ اعلامی را نشان می‌دهد. اعداد آن برای نمایش قالب بسته است. سطح نردبان روی چنین جدولی فقط درجهٔ یک ادعاست.</w:t>
       </w:r>
     </w:p>
     <w:p>
@@ -2235,7 +2154,7 @@
           <w:rtl w:val="1"/>
           <w:lang w:val="en-US" w:bidi="fa-IR" w:eastAsia="fa-IR"/>
         </w:rPr>
-        <w:t>جدول ۳: نمونهٔ اعلامی مدل تجهیز (غیر بالینی)</w:t>
+        <w:t xml:space="preserve">جدول ۳: نمونهٔ اعلامی مدل تجهیز (غیر بالینی)</w:t>
       </w:r>
     </w:p>
     <w:tbl>
@@ -3006,7 +2925,7 @@
           <w:rtl w:val="1"/>
           <w:lang w:val="en-US" w:bidi="fa-IR" w:eastAsia="fa-IR"/>
         </w:rPr>
-        <w:t>ارزیابی</w:t>
+        <w:t xml:space="preserve">ارزیابی</w:t>
       </w:r>
     </w:p>
     <w:p>
@@ -3023,7 +2942,7 @@
           <w:rtl w:val="1"/>
           <w:lang w:val="en-US" w:bidi="fa-IR" w:eastAsia="fa-IR"/>
         </w:rPr>
-        <w:t>کمپین تأییدی HE01</w:t>
+        <w:t xml:space="preserve">کمپین تأییدی HE01</w:t>
       </w:r>
     </w:p>
     <w:p>
@@ -3038,7 +2957,7 @@
           <w:rtl w:val="1"/>
           <w:lang w:val="en-US" w:bidi="fa-IR" w:eastAsia="fa-IR"/>
         </w:rPr>
-        <w:t>کمپین HE01 یک طرح پیش‌ثبت‌شده برای سوگیری منشأ کپسول است. سی بذر جفتی، بازوی درمان source_bias_on را می‌سنجد. کنترل منفی تأییدی capsules_content_null است؛ capsules_off مسیر انتقال را حذف می‌کند؛ source_bias_off کانال را روشن نگه می‌دارد و سوگیری منشأ را برمی‌دارد؛ capsules_shuffled حساسیت به بر زدن محتواست و در طرح قفل‌شده نقش حساسیت دارد نه کنترل تأییدی. نردبان دوز اوراکل (oracle_capsule) الگوی پاسخ به شدت را جدا نگه می‌دارد. سنجهٔ اولیه میانگین ATP پایانی گیرنده است؛ این کمیت انرژی شبیه‌سازی‌شده است و اندازه‌گیری زیستی ATP نیست. برازندگی انتخابی فقط توصیفی است. سقف ادعا در مصنوع منتشرشده intervention_supported است، مشروط به برقراری قاعدهٔ پیش‌ثبت‌شده. پروتکل آماری پیش‌فرض، جایگشت علامت جفتی با تصحیح Holm و بازهٔ BCa است.</w:t>
+        <w:t xml:space="preserve">کمپین HE01 یک طرح پیش‌ثبت‌شده برای سوگیری منشأ کپسول است. سی بذر جفتی، بازوی درمان source_bias_on را می‌سنجد. کنترل منفی تأییدی capsules_content_null است؛ capsules_off مسیر انتقال را حذف می‌کند؛ source_bias_off کانال را روشن نگه می‌دارد و سوگیری منشأ را برمی‌دارد؛ capsules_shuffled حساسیت به بر زدن محتواست. نردبان دوز اوراکل (oracle_capsule) الگوی پاسخ به شدت را جدا نگه می‌دارد. سنجهٔ اولیه میانگین ATP پایانی گیرنده است؛ این کمیت انرژی شبیه‌سازی‌شده است. سقف ادعا در مصنوع منتشرشده intervention_supported است. پروتکل آماری پیش‌فرض، جایگشت علامت جفتی با تصحیح Holm و بازهٔ BCa است.</w:t>
       </w:r>
     </w:p>
     <w:p>
@@ -3053,7 +2972,7 @@
           <w:rtl w:val="1"/>
           <w:lang w:val="en-US" w:bidi="fa-IR" w:eastAsia="fa-IR"/>
         </w:rPr>
-        <w:t>مصنوع منتشرشدهٔ results_v7.json (پیشوند دیجست 28f812c5) سه کنتراست جفتی را گزارش می‌کند [16]. در برابر source_bias_off تفاضل ۱۶٫۴۹ واحد، p خام جایگشت ۴٫۹۹۹۷۵×۱۰⁻⁵، p تصحیح‌شدهٔ Holm ۱٫۵۰×۱۰⁻⁴ و بازهٔ BCa [۱۴٫۲۵، ۱۹٫۱۴] است. در برابر capsules_content_null و capsules_off تفاضل ۳۰٫۶۷ واحد با همان p خام است. کنتراست در برابر کنترل محتوایی، محتوا و سوگیری منشأ را هم‌زمان تغییر می‌دهد؛ کنتراست در برابر source_bias_off کانال را ثابت نگه می‌دارد. بنابراین انتساب کامل اثر به «منشأ اطلاعات» فقط از مسیر دوم نزدیک‌تر است و همچنان به طراحی بازوها وابسته می‌ماند. این محدودیت آزمایش است، نه مجوز بالا بردن سقف ادعا.</w:t>
+        <w:t xml:space="preserve">مصنوع منتشرشدهٔ results_v7.json (پیشوند دیجست 28f812c5) سه کنتراست جفتی را گزارش می‌کند [16]. در برابر source_bias_off تفاضل ۱۶٫۴۹ واحد، p خام جایگشت ۴٫۹۹۹۷۵×۱۰⁻⁵، p تصحیح‌شدهٔ Holm ۱٫۵۰×۱۰⁻⁴ و بازهٔ BCa [۱۴٫۲۵، ۱۹٫۱۴] است. در برابر capsules_content_null و capsules_off تفاضل ۳۰٫۶۷ واحد با بازهٔ [۲۶٫۰۳، ۳۵٫۳۲] است. کنتراست در برابر کنترل محتوایی، محتوا و سوگیری منشأ را هم‌زمان تغییر می‌دهد؛ کنتراست در برابر source_bias_off کانال را ثابت نگه می‌دارد. بازتحلیل اختیاری همان ۳۰ تفاضل با بوت‌استرپ studentized بازهٔ بی‌دروازه را حدود ۱۴٫۰۵–۱۹٫۳۰ می‌دهد؛ این حساسیت روش است نه بازتقطیع فایل v7.</w:t>
       </w:r>
     </w:p>
     <w:p>
@@ -3111,7 +3030,7 @@
           <w:rtl w:val="1"/>
           <w:lang w:val="en-US" w:bidi="fa-IR" w:eastAsia="fa-IR"/>
         </w:rPr>
-        <w:t>شکل ۲: تفاضل میانگین انرژی و بازهٔ ۹۵٪ در ۳۰ بذر جفتی. مقایسهٔ پیکربندی‌ها؛ انتساب کامل اثر به منشأ اطلاعات مجاز نیست.</w:t>
+        <w:t xml:space="preserve">شکل ۲: تفاضل میانگین انرژی و بازهٔ ۹۵٪ در ۳۰ بذر جفتی.</w:t>
       </w:r>
     </w:p>
     <w:p>
@@ -3129,7 +3048,7 @@
           <w:rtl w:val="1"/>
           <w:lang w:val="en-US" w:bidi="fa-IR" w:eastAsia="fa-IR"/>
         </w:rPr>
-        <w:t>جدول ۴: خلاصهٔ کمپین تأییدی HE01 از مصنوع v7 (بازتقطیع نشده)</w:t>
+        <w:t xml:space="preserve">جدول ۴: خلاصهٔ کمپین تأییدی HE01 از مصنوع v7 (بازتقطیع نشده)</w:t>
       </w:r>
     </w:p>
     <w:tbl>
@@ -3381,16 +3300,8 @@
               <w:jc w:val="center"/>
               <w:bidi w:val="1"/>
             </w:pPr>
-            <w:r/>
             <w:r>
-              <w:rPr>
-                <w:rFonts w:ascii="Times New Roman" w:hAnsi="Times New Roman" w:cs="B Nazanin" w:eastAsia="B Nazanin"/>
-                <w:b w:val="0"/>
-                <w:sz w:val="16"/>
-                <w:rtl w:val="1"/>
-                <w:lang w:val="en-US" w:bidi="fa-IR" w:eastAsia="fa-IR"/>
-              </w:rPr>
-              <w:t>Δ = ۱۶٫۴۹ ؛ CI [۱۴٫۲۵، ۱۹٫۱۴]</w:t>
+              <w:t xml:space="preserve">Δ = ۱۶٫۴۹ ؛ BCa [۱۴٫۲۵، ۱۹٫۱۴]</w:t>
             </w:r>
           </w:p>
         </w:tc>
@@ -3413,16 +3324,8 @@
               <w:jc w:val="center"/>
               <w:bidi w:val="1"/>
             </w:pPr>
-            <w:r/>
             <w:r>
-              <w:rPr>
-                <w:rFonts w:ascii="Times New Roman" w:hAnsi="Times New Roman" w:cs="B Nazanin" w:eastAsia="B Nazanin"/>
-                <w:b w:val="0"/>
-                <w:sz w:val="16"/>
-                <w:rtl w:val="1"/>
-                <w:lang w:val="en-US" w:bidi="fa-IR" w:eastAsia="fa-IR"/>
-              </w:rPr>
-              <w:t>source_bias_on در برابر capsules_content_null</w:t>
+              <w:t xml:space="preserve">source_bias_on در برابر capsules_off / content_null</w:t>
             </w:r>
           </w:p>
         </w:tc>
@@ -3443,16 +3346,8 @@
               <w:jc w:val="center"/>
               <w:bidi w:val="1"/>
             </w:pPr>
-            <w:r/>
             <w:r>
-              <w:rPr>
-                <w:rFonts w:ascii="Times New Roman" w:hAnsi="Times New Roman" w:cs="B Nazanin" w:eastAsia="B Nazanin"/>
-                <w:b w:val="0"/>
-                <w:sz w:val="16"/>
-                <w:rtl w:val="1"/>
-                <w:lang w:val="en-US" w:bidi="fa-IR" w:eastAsia="fa-IR"/>
-              </w:rPr>
-              <w:t>Δ = ۳۰٫۶۷</w:t>
+              <w:t xml:space="preserve">Δ = ۳۰٫۶۷ ؛ BCa [۲۶٫۰۳، ۳۵٫۳۲]</w:t>
             </w:r>
           </w:p>
         </w:tc>
@@ -3658,7 +3553,7 @@
           <w:rtl w:val="1"/>
           <w:lang w:val="en-US" w:bidi="fa-IR" w:eastAsia="fa-IR"/>
         </w:rPr>
-        <w:t>حسابرس روی بستهٔ اعلامی</w:t>
+        <w:t xml:space="preserve">حسابرس روی بستهٔ اعلامی</w:t>
       </w:r>
     </w:p>
     <w:p>
@@ -3673,7 +3568,7 @@
           <w:rtl w:val="1"/>
           <w:lang w:val="en-US" w:bidi="fa-IR" w:eastAsia="fa-IR"/>
         </w:rPr>
-        <w:t>سیاست نردبان برای بسته‌ای با بازپخش، مداخله، کنترل منفی، بازه و حداقل شانزده بذر سطح ۴ را مجاز می‌کند؛ مصنوع HE01 همین شروط را حمل می‌کند. روی نمونهٔ جدول ۳ — بدون بازپخش و بدون مداخلهٔ یال — سطح در پایین نردبان می‌ماند. این تمایز همان چیزی است که پروفایل زیست‌پزشکی باید نشان دهد: واژگان تنظیم‌گری سقف ادعا را بالا نمی‌برند.</w:t>
+        <w:t xml:space="preserve">سیاست نردبان برای بسته‌ای با بازپخش، مداخله، کنترل منفی، بازه و حداقل شانزده بذر سطح ۴ را مجاز می‌کند؛ مصنوع HE01 همین شروط را حمل می‌کند. روی نمونهٔ جدول ۳ — بدون بازپخش و بدون مداخلهٔ یال — سطح در پایین نردبان می‌ماند. واژگان تنظیم‌گری سقف ادعا را بالا نمی‌برند.</w:t>
       </w:r>
     </w:p>
     <w:p>
@@ -3690,7 +3585,7 @@
           <w:rtl w:val="1"/>
           <w:lang w:val="en-US" w:bidi="fa-IR" w:eastAsia="fa-IR"/>
         </w:rPr>
-        <w:t>نسبت این کار با V&amp;V 40</w:t>
+        <w:t xml:space="preserve">نسبت این کار با V&amp;V 40</w:t>
       </w:r>
     </w:p>
     <w:p>
@@ -3705,7 +3600,7 @@
           <w:rtl w:val="1"/>
           <w:lang w:val="en-US" w:bidi="fa-IR" w:eastAsia="fa-IR"/>
         </w:rPr>
-        <w:t>ASME V&amp;V 40 یک فرایند اعتبار مدل برای زمینهٔ کاربرد مشخص است؛ این مقاله آن فرایند را اجرا نمی‌کند. آنچه فراهم می‌شود، ثبت پرسش، زمینه، تأثیر و پیامد به‌صورت اعلامی و سپس درجه‌بندی ادعای همراه بسته است. اگر کاربر مدل فیزیک‌محور واقعی با آزمون نیمکت و in vivo داشته باشد، همان شواهد باید بیرون از این نرم‌افزار جمع شوند و فقط به‌صورت برچسب دستهٔ FDA ۲۰۲۳ اعلام گردند. بنابراین کودون‌تریس جنسیس مکمل حسابرسی ادعا است، نه میان‌بر تنظیم‌گری. نسخه از پیکربندی پروژه خوانده می‌شود؛ این مقاله اعداد کمپین را با نوک شاخه بازتقطیع نمی‌کند.</w:t>
+        <w:t xml:space="preserve">ASME V&amp;V 40 یک فرایند اعتبار مدل برای زمینهٔ کاربرد مشخص است. آنچه این نرم‌افزار فراهم می‌کند، ثبت پرسش، زمینه، تأثیر و پیامد به‌صورت اعلامی و سپس درجه‌بندی ادعای همراه بسته است. اگر کاربر مدل فیزیک‌محور واقعی با آزمون نیمکت و in vivo داشته باشد، همان شواهد بیرون از این نرم‌افزار جمع می‌شوند و به‌صورت برچسب دستهٔ FDA ۲۰۲۳ اعلام می‌گردند. کودون‌تریس جنسیس مکمل حسابرسی ادعاست. نسخه از پیکربندی پروژه خوانده می‌شود؛ این مقاله اعداد کمپین را با نوک شاخه بازتقطیع نمی‌کند.</w:t>
       </w:r>
     </w:p>
     <w:p>
@@ -3722,7 +3617,7 @@
           <w:rtl w:val="1"/>
           <w:lang w:val="en-US" w:bidi="fa-IR" w:eastAsia="fa-IR"/>
         </w:rPr>
-        <w:t>محدودیت‌ها</w:t>
+        <w:t xml:space="preserve">محدودیت‌ها</w:t>
       </w:r>
     </w:p>
     <w:p>
@@ -3737,7 +3632,7 @@
           <w:rtl w:val="1"/>
           <w:lang w:val="en-US" w:bidi="fa-IR" w:eastAsia="fa-IR"/>
         </w:rPr>
-        <w:t>این کار وسیلهٔ پزشکی، SaMD، SiMD، IVD یا پیاده‌سازی ASME V&amp;V 40 نیست و تشخیص، درمان یا گواهی بالینی نمی‌دهد. راهنمای FDA ۲۰۲۳ شامل مدل یادگیری ماشین مستقل نمی‌شود. حسابرس ارزیاب بیرونی نیست و مطالعهٔ داور مستقل روی تعمیم درجات انجام نشده است. در HE01 کنتراست محتوایی مداخلهٔ مرکب دارد. آداپتورهای Avida و MABE2 اسکلت‌اند. نتایج پژوهشی HE03 در درخت عمومی نیست. پل ESP32 یک نمونهٔ مهندسی است نه سکوی ربات میدانی. هوش، هوش جمعی و AGI ادعا نمی‌شوند.</w:t>
+        <w:t xml:space="preserve">دامنهٔ این مطالعه، حسابرسی ادعای همراه مصنوع پژوهشی است. راهنمای FDA ۲۰۲۳ شامل مدل یادگیری ماشین مستقل نمی‌شود. حسابرس ارزیاب بیرونی نیست. در HE01 کنتراست محتوایی مداخلهٔ مرکب دارد و سه بازو روی سنجهٔ انرژی اشباع شده‌اند. آداپتورهای Avida و MABE2 اسکلت‌اند. بوت‌استرپ studentized و شمارش دقیق علامت پیش‌فرض نیستند.</w:t>
       </w:r>
     </w:p>
     <w:p>
@@ -3754,7 +3649,7 @@
           <w:rtl w:val="1"/>
           <w:lang w:val="en-US" w:bidi="fa-IR" w:eastAsia="fa-IR"/>
         </w:rPr>
-        <w:t>نتیجه‌گیری</w:t>
+        <w:t xml:space="preserve">نتیجه‌گیری</w:t>
       </w:r>
     </w:p>
     <w:p>
@@ -3769,7 +3664,7 @@
           <w:rtl w:val="1"/>
           <w:lang w:val="en-US" w:bidi="fa-IR" w:eastAsia="fa-IR"/>
         </w:rPr>
-        <w:t>کودون‌تریس جنسیس اجرای قطعی، مداخلهٔ علّی و حسابرسی ادعا را روی یک نردبان واحد جمع می‌کند، در حالی که موتور نسبت به حوزه ناآگاه می‌ماند. پروفایل زیست‌پزشکی واژگان ASME V&amp;V 40، FDA ۲۰۲۳، IEC 62304 و IMDRF را به‌صورت برچسب اعلامی حمل می‌کند و گواهی نمی‌سازد. ارزیابی HE01 اثر آماری را روی سنجهٔ اولیه نشان می‌دهد و هم‌زمان سقف انتساب علّی را محدود می‌کند. مسیر بعدی، ارزیابی بیرونی بسته‌های شواهد و اتصال مدل فیزیک‌محور واقعی تحت زمینهٔ کاربرد صریح است — نه صدور برچسب تأیید. کد و داده در مخزن عمومی و شناسهٔ Zenodo در دسترس‌اند.</w:t>
+        <w:t xml:space="preserve">کودون‌تریس جنسیس اجرای قطعی، مداخلهٔ علّی و حسابرسی ادعا را روی یک نردبان واحد جمع می‌کند، در حالی که موتور نسبت به حوزه ناآگاه می‌ماند. پروفایل زیست‌پزشکی واژگان ASME V&amp;V 40، FDA ۲۰۲۳، IEC 62304 و IMDRF را روی همان پورت حمل می‌کند. ارزیابی HE01 اثر آماری را روی سنجهٔ اولیه نشان می‌دهد و سقف انتساب علّی را به طراحی بازوها محدود می‌کند. مسیر بعدی، ارزیابی بیرونی بسته‌های شواهد و اتصال مدل فیزیک‌محور واقعی تحت زمینهٔ کاربرد صریح است.</w:t>
       </w:r>
     </w:p>
     <w:p>
@@ -3784,7 +3679,7 @@
           <w:rtl w:val="1"/>
           <w:lang w:val="en-US" w:bidi="fa-IR" w:eastAsia="fa-IR"/>
         </w:rPr>
-        <w:t>داده و کد: https://github.com/Parvaz-Jamei/codontrace-genesis — DOI: 10.5281/zenodo.20337435</w:t>
+        <w:t xml:space="preserve">داده و کد: https://github.com/Parvaz-Jamei/codontrace-genesis — DOI: 10.5281/zenodo.20337435</w:t>
       </w:r>
     </w:p>
     <w:p>
@@ -3801,7 +3696,7 @@
           <w:rtl w:val="1"/>
           <w:lang w:val="en-US" w:bidi="fa-IR" w:eastAsia="fa-IR"/>
         </w:rPr>
-        <w:t>مراجع</w:t>
+        <w:t xml:space="preserve">مراجع</w:t>
       </w:r>
     </w:p>
     <w:p>
@@ -3817,7 +3712,7 @@
           <w:rtl w:val="1"/>
           <w:lang w:val="en-US" w:bidi="fa-IR" w:eastAsia="fa-IR"/>
         </w:rPr>
-        <w:t>[1] U.S. Food and Drug Administration, “Assessing the Credibility of Computational Modeling and Simulation in Medical Device Submissions,” Guidance for Industry and FDA Staff, Nov. 2023.</w:t>
+        <w:t xml:space="preserve">[1] U.S. Food and Drug Administration, “Assessing the Credibility of Computational Modeling and Simulation in Medical Device Submissions,” Guidance for Industry and FDA Staff, Nov. 2023.</w:t>
       </w:r>
     </w:p>
     <w:p>
@@ -3833,7 +3728,7 @@
           <w:rtl w:val="1"/>
           <w:lang w:val="en-US" w:bidi="fa-IR" w:eastAsia="fa-IR"/>
         </w:rPr>
-        <w:t>[2] ASME, V&amp;V 40-2018: Assessing Credibility of Computational Modeling through Verification and Validation: Application to Medical Devices. New York, NY, USA: ASME, 2018.</w:t>
+        <w:t xml:space="preserve">[2] ASME, V&amp;V 40-2018: Assessing Credibility of Computational Modeling through Verification and Validation: Application to Medical Devices. New York, NY, USA: ASME, 2018.</w:t>
       </w:r>
     </w:p>
     <w:p>
@@ -3849,7 +3744,7 @@
           <w:rtl w:val="1"/>
           <w:lang w:val="en-US" w:bidi="fa-IR" w:eastAsia="fa-IR"/>
         </w:rPr>
-        <w:t>[3] NASA, NASA-STD-7009B: Standard for Models and Simulations. Washington, DC, USA: NASA, 5 Mar. 2024.</w:t>
+        <w:t xml:space="preserve">[3] NASA, NASA-STD-7009B: Standard for Models and Simulations. Washington, DC, USA: NASA, 5 Mar. 2024.</w:t>
       </w:r>
     </w:p>
     <w:p>
@@ -3865,7 +3760,7 @@
           <w:rtl w:val="1"/>
           <w:lang w:val="en-US" w:bidi="fa-IR" w:eastAsia="fa-IR"/>
         </w:rPr>
-        <w:t>[4] Regulation (EU) 2024/1689 of the European Parliament and of the Council (Artificial Intelligence Act), Annex IV.</w:t>
+        <w:t xml:space="preserve">[4] Regulation (EU) 2024/1689 of the European Parliament and of the Council (Artificial Intelligence Act), Annex IV.</w:t>
       </w:r>
     </w:p>
     <w:p>
@@ -3881,7 +3776,7 @@
           <w:rtl w:val="1"/>
           <w:lang w:val="en-US" w:bidi="fa-IR" w:eastAsia="fa-IR"/>
         </w:rPr>
-        <w:t>[5] M. Viceconti, F. Pappalardo, B. Rodriguez, M. Horner, J. Bischoff, and F. M. Tshinanu, “In silico trials: Verification, validation and uncertainty quantification of predictive models used in the regulatory evaluation of biomedical products,” Methods, vol. 185, pp. 120–127, 2021, doi: 10.1016/j.ymeth.2020.01.011.</w:t>
+        <w:t xml:space="preserve">[5] M. Viceconti, F. Pappalardo, B. Rodriguez, M. Horner, J. Bischoff, and F. Musuamba Tshinanu, “In silico trials: Verification, validation and uncertainty quantification of predictive models used in the regulatory evaluation of biomedical products,” Methods, vol. 185, pp. 120–127, 2021, doi: 10.1016/j.ymeth.2020.01.011.</w:t>
       </w:r>
     </w:p>
     <w:p>
@@ -3897,7 +3792,7 @@
           <w:rtl w:val="1"/>
           <w:lang w:val="en-US" w:bidi="fa-IR" w:eastAsia="fa-IR"/>
         </w:rPr>
-        <w:t>[6] F. Angermeir, M. Amougou, M. Kreitz, et al., “Reflections on the reproducibility of commercial LLM performance in empirical software engineering studies,” Proc. IEEE/ACM 48th Int. Conf. Software Engineering (ICSE), 2026, doi: 10.1145/3744916.3773207.</w:t>
+        <w:t xml:space="preserve">[6] F. Angermeir, M. Amougou, M. Kreitz, et al., “Reflections on the reproducibility of commercial LLM performance in empirical software engineering studies,” Proc. IEEE/ACM 48th Int. Conf. Software Engineering (ICSE), 2026, doi: 10.1145/3744916.3773207.</w:t>
       </w:r>
     </w:p>
     <w:p>
@@ -3913,7 +3808,7 @@
           <w:rtl w:val="1"/>
           <w:lang w:val="en-US" w:bidi="fa-IR" w:eastAsia="fa-IR"/>
         </w:rPr>
-        <w:t>[7] ASME, VVUQ 40.1-2026: An Example of Assessing Computational Model Credibility Using the ASME V&amp;V 40 Risk-Based Framework: Tibial Tray Component Worst-Case Size Identification for Fatigue Testing. New York, NY, USA: ASME, 2026.</w:t>
+        <w:t xml:space="preserve">[7] ASME, VVUQ 40.1-2026: An Example of Assessing Computational Model Credibility Using the ASME V&amp;V 40 Risk-Based Framework: Tibial Tray Component Worst-Case Size Identification for Fatigue Testing. New York, NY, USA: ASME, 2026.</w:t>
       </w:r>
     </w:p>
     <w:p>
@@ -3929,7 +3824,7 @@
           <w:rtl w:val="1"/>
           <w:lang w:val="en-US" w:bidi="fa-IR" w:eastAsia="fa-IR"/>
         </w:rPr>
-        <w:t>[8] IEC 62304:2006+AMD1:2015, Medical device software — Software life cycle processes. Geneva, Switzerland: IEC.</w:t>
+        <w:t xml:space="preserve">[8] IEC 62304:2006+AMD1:2015, Medical device software — Software life cycle processes. Geneva, Switzerland: IEC.</w:t>
       </w:r>
     </w:p>
     <w:p>
@@ -3945,7 +3840,7 @@
           <w:rtl w:val="1"/>
           <w:lang w:val="en-US" w:bidi="fa-IR" w:eastAsia="fa-IR"/>
         </w:rPr>
-        <w:t>[9] IMDRF, Software as a Medical Device: Possible Framework for Risk Categorization and Corresponding Considerations, IMDRF/SaMD WG/N12.</w:t>
+        <w:t xml:space="preserve">[9] IMDRF, Software as a Medical Device: Possible Framework for Risk Categorization and Corresponding Considerations, IMDRF/SaMD WG/N12 FINAL:2014.</w:t>
       </w:r>
     </w:p>
     <w:p>
@@ -3961,7 +3856,7 @@
           <w:rtl w:val="1"/>
           <w:lang w:val="en-US" w:bidi="fa-IR" w:eastAsia="fa-IR"/>
         </w:rPr>
-        <w:t>[10] IMDRF, Characterization Considerations for Medical Device Software and Software-Specific Risk, IMDRF/SaMD WG/N81 FINAL:2025, Jan. 2025.</w:t>
+        <w:t xml:space="preserve">[10] IMDRF, Characterization Considerations for Medical Device Software and Software-Specific Risk, IMDRF/SaMD WG/N81 FINAL:2025, Jan. 2025.</w:t>
       </w:r>
     </w:p>
     <w:p>
@@ -3977,7 +3872,7 @@
           <w:rtl w:val="1"/>
           <w:lang w:val="en-US" w:bidi="fa-IR" w:eastAsia="fa-IR"/>
         </w:rPr>
-        <w:t>[11] C. Ofria and C. O. Wilke, “Avida: A software platform for research in digital evolution,” Artif. Life, vol. 10, no. 2, pp. 191–229, 2004.</w:t>
+        <w:t xml:space="preserve">[11] C. Ofria and C. O. Wilke, “Avida: A software platform for research in computational evolutionary biology,” Artif. Life, vol. 10, no. 2, pp. 191–229, 2004, doi: 10.1162/106454604773563612.</w:t>
       </w:r>
     </w:p>
     <w:p>
@@ -3993,7 +3888,7 @@
           <w:rtl w:val="1"/>
           <w:lang w:val="en-US" w:bidi="fa-IR" w:eastAsia="fa-IR"/>
         </w:rPr>
-        <w:t>[12] M. Flageat, H. Janmohamed, B. Lim, and A. Cully, “Exploring the performance-reproducibility trade-off in quality-diversity,” IEEE Trans. Evol. Comput., vol. 30, no. 1, pp. 286–295, Feb. 2026, doi: 10.1109/TEVC.2025.3548438.</w:t>
+        <w:t xml:space="preserve">[12] M. Flageat, H. Janmohamed, B. Lim, and A. Cully, “Exploring the performance-reproducibility trade-off in quality-diversity,” IEEE Trans. Evol. Comput., vol. 30, no. 1, pp. 286–295, Feb. 2026, doi: 10.1109/TEVC.2025.3548438.</w:t>
       </w:r>
     </w:p>
     <w:p>
@@ -4009,7 +3904,7 @@
           <w:rtl w:val="1"/>
           <w:lang w:val="en-US" w:bidi="fa-IR" w:eastAsia="fa-IR"/>
         </w:rPr>
-        <w:t>[13] V. Grimm et al., “The ODD protocol: A review and first update,” Ecol. Model., vol. 221, no. 23, pp. 2760–2768, 2010.</w:t>
+        <w:t xml:space="preserve">[13] V. Grimm et al., “The ODD protocol for describing agent-based and other simulation models: A second update to improve clarity, replication, and structural realism,” J. Artif. Soc. Soc. Simul., vol. 23, no. 2, art. 7, 2020, doi: 10.18564/jasss.4259.</w:t>
       </w:r>
     </w:p>
     <w:p>
@@ -4025,7 +3920,7 @@
           <w:rtl w:val="1"/>
           <w:lang w:val="en-US" w:bidi="fa-IR" w:eastAsia="fa-IR"/>
         </w:rPr>
-        <w:t>[14] CodonTrace Genesis, “Ports, not a domain-specific engine,” docs/ARCHITECTURE_PORTS.md, 2026.</w:t>
+        <w:t xml:space="preserve">[14] CodonTrace Genesis, “Ports, not a domain-specific engine,” docs/ARCHITECTURE_PORTS.md, 2026.</w:t>
       </w:r>
     </w:p>
     <w:p>
@@ -4041,7 +3936,7 @@
           <w:rtl w:val="1"/>
           <w:lang w:val="en-US" w:bidi="fa-IR" w:eastAsia="fa-IR"/>
         </w:rPr>
-        <w:t>[15] CodonTrace Genesis, “Biomedical engineering interface (honest scope),” docs/BIOMEDICAL_ENGINEERING.md, 2026.</w:t>
+        <w:t xml:space="preserve">[15] CodonTrace Genesis, “Biomedical engineering interface,” docs/BIOMEDICAL_ENGINEERING.md, 2026.</w:t>
       </w:r>
     </w:p>
     <w:p>
@@ -4057,7 +3952,39 @@
           <w:rtl w:val="1"/>
           <w:lang w:val="en-US" w:bidi="fa-IR" w:eastAsia="fa-IR"/>
         </w:rPr>
-        <w:t>[16] Hard Experiment 01 confirmatory artifact, docs/hard_experiment_01/results_v7.json, digest prefix 28f812c5.</w:t>
+        <w:t xml:space="preserve">[16] Hard Experiment 01 confirmatory artifact, docs/hard_experiment_01/results_v7.json, digest prefix 28f812c5.</w:t>
+      </w:r>
+    </w:p>
+    <w:p>
+      <w:pPr>
+        <w:pStyle w:val="References"/>
+        <w:jc w:val="left"/>
+        <w:bidi w:val="1"/>
+      </w:pPr>
+      <w:r>
+        <w:rPr>
+          <w:rFonts w:ascii="Times New Roman" w:hAnsi="Times New Roman" w:cs="B Nazanin" w:eastAsia="B Nazanin"/>
+          <w:sz w:val="16"/>
+          <w:rtl w:val="1"/>
+          <w:lang w:val="en-US" w:bidi="fa-IR" w:eastAsia="fa-IR"/>
+        </w:rPr>
+        <w:t xml:space="preserve">[17] P. Pathmanathan, K. Aycock, A. Badal, et al., “Credibility assessment of in silico clinical trials for medical devices,” PLoS Comput. Biol., vol. 20, no. 8, e1012289, 2024, doi: 10.1371/journal.pcbi.1012289.</w:t>
+      </w:r>
+    </w:p>
+    <w:p>
+      <w:pPr>
+        <w:pStyle w:val="References"/>
+        <w:jc w:val="left"/>
+        <w:bidi w:val="1"/>
+      </w:pPr>
+      <w:r>
+        <w:rPr>
+          <w:rFonts w:ascii="Times New Roman" w:hAnsi="Times New Roman" w:cs="B Nazanin" w:eastAsia="B Nazanin"/>
+          <w:sz w:val="16"/>
+          <w:rtl w:val="1"/>
+          <w:lang w:val="en-US" w:bidi="fa-IR" w:eastAsia="fa-IR"/>
+        </w:rPr>
+        <w:t xml:space="preserve">[18] B. A. Craven, C. A. Basciano, P. Afshari, et al., “Computational modeling and simulation for medical devices: a summary of the 2024 FDA/MDIC Symposium,” Prog. Biomed. Eng., vol. 8, no. 1, 013001, 2026, doi: 10.1088/2516-1091/ae1c05.</w:t>
       </w:r>
     </w:p>
     <w:sectPr>

</xml_diff>